<commit_message>
Prepare App Store builds and Xcode installer workflow
Add sandboxed Store build preparation, manual setup and migration, private diagnostics, feasibility checks, and deployment documentation. Add shared Xcode build and installer schemes with repository navigation and developer instructions.
</commit_message>
<xml_diff>
--- a/docs/dev/architecture.docx
+++ b/docs/dev/architecture.docx
@@ -22,18 +22,7 @@
         <w:spacing w:after="120"/>
       </w:pPr>
       <w:r>
-        <w:t xml:space="preserve">Mail-Filter is a native macOS settings app and MailKit extension that analyzes incoming Apple Mail messages on-device and requests Junk actions for verified political solicitations. This guide explains how the code fits together, why the boundaries exist, and the invariants to preserve when changing it. It describes the build 12 implementation, based on commit </w:t>
-      </w:r>
-      <w:r>
-        <w:rPr>
-          <w:rFonts w:ascii="Courier New" w:hAnsi="Courier New" w:cs="Courier New"/>
-          <w:sz w:val="19"/>
-          <w:shd w:val="clear" w:color="auto" w:fill="F2F2F2"/>
-        </w:rPr>
-        <w:t xml:space="preserve">df807d3</w:t>
-      </w:r>
-      <w:r>
-        <w:t xml:space="preserve">.</w:t>
+        <w:t xml:space="preserve">Mail-Filter is a native macOS settings app and MailKit extension that analyzes incoming Apple Mail messages on-device and requests Junk actions for verified political solicitations. This guide explains how the code fits together, why the boundaries exist, and the invariants to preserve when changing it. It covers build 14 source, including Store preparation alongside direct distribution. The Store configuration compiles as an unsigned archive; provisioned runtime qualification remains outstanding.</w:t>
       </w:r>
     </w:p>
     <w:p>
@@ -119,7 +108,7 @@
         <w:spacing w:after="120"/>
       </w:pPr>
       <w:r>
-        <w:t xml:space="preserve">The installed product contains a settings app, an embedded MailKit extension, an engineering CLI, and a separate uninstaller. The settings window does not host the extension. Mail loads the extension in its own process and calls it as messages arrive. Closing Mail-Filter leaves that process independent; Mail must be running and the Mac awake for incoming processing.</w:t>
+        <w:t xml:space="preserve">The direct installer contains a settings app, an embedded MailKit extension, an engineering CLI, and a separate uninstaller. The Store payload contains only the settings app and extension. The settings window does not host the extension. Mail loads the extension in its own process and calls it as messages arrive. Closing Mail-Filter leaves that process independent; Mail must be running and the Mac awake for incoming processing.</w:t>
       </w:r>
     </w:p>
     <w:tbl>
@@ -368,7 +357,7 @@
         <w:spacing w:after="120"/>
       </w:pPr>
       <w:r>
-        <w:t xml:space="preserve">The native product is compiled from explicit file lists in </w:t>
+        <w:t xml:space="preserve">The direct product is compiled from explicit file lists in </w:t>
       </w:r>
       <w:r>
         <w:rPr>
@@ -377,6 +366,17 @@
           <w:shd w:val="clear" w:color="auto" w:fill="F2F2F2"/>
         </w:rPr>
         <w:t xml:space="preserve">MacApp/build.sh</w:t>
+      </w:r>
+      <w:r>
+        <w:t xml:space="preserve">. The Store Xcode project is generated deterministically from explicit lists in </w:t>
+      </w:r>
+      <w:r>
+        <w:rPr>
+          <w:rFonts w:ascii="Courier New" w:hAnsi="Courier New" w:cs="Courier New"/>
+          <w:sz w:val="19"/>
+          <w:shd w:val="clear" w:color="auto" w:fill="F2F2F2"/>
+        </w:rPr>
+        <w:t xml:space="preserve">MacApp/Store/generate-project.py</w:t>
       </w:r>
       <w:r>
         <w:t xml:space="preserve">. Shared Swift files are compiled into each executable that needs them; they are not a separately packaged framework. The root Swift package builds only the CLI and its tests.</w:t>
@@ -3044,7 +3044,53 @@
         <w:spacing w:after="120"/>
       </w:pPr>
       <w:r>
-        <w:t xml:space="preserve">Settings and activity use schema version 1; the embedded filtering configuration uses schema version 2. Writes are atomic and owner-readable/writable; newly created private directories use mode 0700. Settings/activity are bounded to 1 MiB. Protection accepts at most 100,000 digests within a 16 MiB input bound. Settings and protection have distinct locks; preserve their lock order and do not hold a lock across model generation.</w:t>
+        <w:t xml:space="preserve">Settings and activity use schema version 1; the embedded filtering configuration uses schema version 2. Writes are atomic and owner-readable/writable; newly created private directories use mode 0700. Activity is bounded to 1 MiB; settings allow 16 MiB for imported recovery digests. Protection accepts at most 100,000 digests within a 16 MiB input bound. Settings and protection have distinct locks; preserve their lock order and do not hold a lock across model generation.</w:t>
+      </w:r>
+    </w:p>
+    <w:p>
+      <w:pPr>
+        <w:spacing w:after="120"/>
+      </w:pPr>
+      <w:r>
+        <w:rPr>
+          <w:rFonts w:ascii="Courier New" w:hAnsi="Courier New" w:cs="Courier New"/>
+          <w:sz w:val="19"/>
+          <w:shd w:val="clear" w:color="auto" w:fill="F2F2F2"/>
+        </w:rPr>
+        <w:t xml:space="preserve">SetupArchive</w:t>
+      </w:r>
+      <w:r>
+        <w:t xml:space="preserve"> is a versioned private export with full native settings and native recovery digests. Import validates policy against UI inventory and selection, merges destination protection and inherited CLI identities, and writes a destination backup. Incoming digests commit in the same atomic settings replacement through optional </w:t>
+      </w:r>
+      <w:r>
+        <w:rPr>
+          <w:rFonts w:ascii="Courier New" w:hAnsi="Courier New" w:cs="Courier New"/>
+          <w:sz w:val="19"/>
+          <w:shd w:val="clear" w:color="auto" w:fill="F2F2F2"/>
+        </w:rPr>
+        <w:t xml:space="preserve">importedProtection</w:t>
+      </w:r>
+      <w:r>
+        <w:t xml:space="preserve">. Optional </w:t>
+      </w:r>
+      <w:r>
+        <w:rPr>
+          <w:rFonts w:ascii="Courier New" w:hAnsi="Courier New" w:cs="Courier New"/>
+          <w:sz w:val="19"/>
+          <w:shd w:val="clear" w:color="auto" w:fill="F2F2F2"/>
+        </w:rPr>
+        <w:t xml:space="preserve">activationRequired</w:t>
+      </w:r>
+      <w:r>
+        <w:t xml:space="preserve"> blocks both classifier admission and the final action gate until confirmation. Confirmation changes the revision and preserves pause. These additive settings fields remain readable from older schema-1 files; older binaries do not implement the new migration gate, so do not downgrade a migrated installation without preserving its recovery data.</w:t>
+      </w:r>
+    </w:p>
+    <w:p>
+      <w:pPr>
+        <w:spacing w:after="120"/>
+      </w:pPr>
+      <w:r>
+        <w:t xml:space="preserve">The UI imports one archive or an explicitly selected legacy folder containing both siblings. It never assumes a selected settings file authorizes an adjacent protection file. Saving settings no longer probes CLI state or retired containers implicitly. Manual account groups use local IDs and preserve the separate own-address and selected-recipient sets.</w:t>
       </w:r>
     </w:p>
     <w:p>
@@ -3124,7 +3170,26 @@
         <w:spacing w:after="120"/>
       </w:pPr>
       <w:r>
-        <w:t xml:space="preserve">Ordinary activity records contain stages, categories, timestamps, attempt numbers, safe error domain/code and an optional 12-character identity digest. They exclude subjects, addresses, bodies, model response text and generated explanations. The report displays the latest 30 events, while the file retains up to 500. Log collection is restricted to </w:t>
+        <w:t xml:space="preserve">Ordinary activity records contain stages, categories, timestamps, attempt numbers, safe error domain/code and an optional 12-character identity digest. They exclude subjects, addresses, bodies, model response text and generated explanations. The report displays the latest 30 activity events, while activity retains up to 500. Supplemental JSON-lines files rotate under the same store lock at one MiB, with at most three files. Reports filter to seven days and expired files are pruned on a later write. Rotation never expires recovery protection. Log-write failure leaves the saved activity usable.</w:t>
+      </w:r>
+    </w:p>
+    <w:p>
+      <w:pPr>
+        <w:spacing w:after="120"/>
+      </w:pPr>
+      <w:r>
+        <w:t xml:space="preserve">The Store build reads this private history and exports reports through a Save panel; it compiles out the system-log collector with </w:t>
+      </w:r>
+      <w:r>
+        <w:rPr>
+          <w:rFonts w:ascii="Courier New" w:hAnsi="Courier New" w:cs="Courier New"/>
+          <w:sz w:val="19"/>
+          <w:shd w:val="clear" w:color="auto" w:fill="F2F2F2"/>
+        </w:rPr>
+        <w:t xml:space="preserve">APP_STORE</w:t>
+      </w:r>
+      <w:r>
+        <w:t xml:space="preserve">. The direct developer build may also collect </w:t>
       </w:r>
       <w:r>
         <w:rPr>
@@ -3135,7 +3200,7 @@
         <w:t xml:space="preserve">org.mail-filter.app</w:t>
       </w:r>
       <w:r>
-        <w:t xml:space="preserve">, keeps a 32,000-byte tail, and stops after 10 seconds. A missing event is not proof that Mail did not invoke the handler: records may be older than retention or storage may have failed.</w:t>
+        <w:t xml:space="preserve"> logs, keeping a 32,000-byte tail and stopping after ten seconds. A missing event is not proof that Mail did not invoke the handler: records may be older than retention or storage may have failed. User-opened email files use the same MIME/model/verifier path and can be exported separately; recipient matching is diagnostic and never grants a mailbox action.</w:t>
       </w:r>
     </w:p>
     <w:p>
@@ -3190,7 +3255,23 @@
         <w:spacing w:after="120"/>
       </w:pPr>
       <w:r>
-        <w:t xml:space="preserve">The native scripts compile host, extension and uninstaller in Swift 5 language mode for arm64 macOS 26, build the CLI in Swift 6 mode, generate bundle metadata/entitlements, embed default resources, and sign nested executables before the host. The Swift package requires tools version 6.2. There is no Xcode project or external library dependency; full Xcode supplies the required SDK.</w:t>
+        <w:t xml:space="preserve">The direct scripts compile host, extension and uninstaller in Swift 5 language mode for arm64 macOS 26, build the CLI in Swift 6 mode, generate bundle metadata/entitlements, embed default resources, and sign nested executables before the host. The Swift package requires tools version 6.2. The Store Xcode project uses the same core sources, sandboxed host/extension, user-selected file access and a Mail-targeted host automation exception. Development and production identities/groups differ. Full Xcode supplies the SDK; no external library dependency is introduced.</w:t>
+      </w:r>
+    </w:p>
+    <w:p>
+      <w:pPr>
+        <w:spacing w:after="120"/>
+      </w:pPr>
+      <w:r>
+        <w:rPr>
+          <w:rFonts w:ascii="Courier New" w:hAnsi="Courier New" w:cs="Courier New"/>
+          <w:sz w:val="19"/>
+          <w:shd w:val="clear" w:color="auto" w:fill="F2F2F2"/>
+        </w:rPr>
+        <w:t xml:space="preserve">store-build.sh check</w:t>
+      </w:r>
+      <w:r>
+        <w:t xml:space="preserve"> produces an unsigned archive with development identities and checks payload exclusions and privacy manifests. Signed development, production archive and local App Store Connect export require an approved account and profiles. The verifier checks signed entitlements and group authorization when signatures are required. No Store command installs, enables or submits a filtering extension. Xcode records build products with Launch Services; development identities keep compile checks distinct from production.</w:t>
       </w:r>
     </w:p>
     <w:p>

</xml_diff>

<commit_message>
Remove deleted Mail accounts on inventory refresh
</commit_message>
<xml_diff>
--- a/docs/dev/architecture.docx
+++ b/docs/dev/architecture.docx
@@ -1836,6 +1836,34 @@
       </w:r>
       <w:r>
         <w:t xml:space="preserve"> The handler does not receive the CLI's exact Mail account ID. It routes by delivered-to/original-to headers or visible recipients, so aliases, forwarding, Bcc, shared addresses and delivery into several accounts can be ambiguous. The UI selects stable account IDs, then saves their recipient addresses. All addresses from the collected inventory protect own-sender mail, including accounts not selected for filtering. Refresh the inventory when accounts or aliases change.</w:t>
+      </w:r>
+    </w:p>
+    <w:p>
+      <w:pPr>
+        <w:spacing w:after="120"/>
+      </w:pPr>
+      <w:r>
+        <w:t xml:space="preserve">Account refresh treats a successful Mail inventory as authoritative. </w:t>
+      </w:r>
+      <w:r>
+        <w:rPr>
+          <w:rFonts w:ascii="Courier New" w:hAnsi="Courier New" w:cs="Courier New"/>
+          <w:sz w:val="19"/>
+          <w:shd w:val="clear" w:color="auto" w:fill="F2F2F2"/>
+        </w:rPr>
+        <w:t xml:space="preserve">NativeAccount.refreshed</w:t>
+      </w:r>
+      <w:r>
+        <w:t xml:space="preserve"> replaces the displayed list, retaining checked and unchecked choices by stable ID even when names or aliases change. Address matching supports transition from manual setup to discovered accounts. Removed accounts and missing manual aliases are not recreated from saved own-sender addresses. Discovery failure leaves the current list intact. Refresh changes the UI draft; </w:t>
+      </w:r>
+      <w:r>
+        <w:rPr>
+          <w:b/>
+        </w:rPr>
+        <w:t xml:space="preserve">Save Settings</w:t>
+      </w:r>
+      <w:r>
+        <w:t xml:space="preserve"> rebuilds recipient and own-sender addresses from that draft without clearing restored-message protection.</w:t>
       </w:r>
     </w:p>
     <w:p>

</xml_diff>

<commit_message>
Add model reliability diagnostics and isolated Dev testing
Exercise retries, deadlines and final action guards with injected failures; compare original model budgets without claiming the reported Mac failure is fixed. Keep replacement review on hold pending a plausible reproduction.

Add Dev-only self-mail opt-in, optional keyword validation and Restore defaults. Update the engineering guides and generated Word documents. Preserve the installed Store app and its settings.
</commit_message>
<xml_diff>
--- a/docs/dev/architecture.docx
+++ b/docs/dev/architecture.docx
@@ -22,7 +22,7 @@
         <w:spacing w:after="120"/>
       </w:pPr>
       <w:r>
-        <w:t xml:space="preserve">Mail-Filter is a native macOS settings app and MailKit extension that analyzes incoming Apple Mail messages on-device and requests Junk actions for verified political solicitations. This guide explains how the code fits together, why the boundaries exist, and the invariants to preserve when changing it. It covers build 15 source, including the unified Xcode build and Store preparation alongside direct distribution. Signed Development runtime checks have passed; the deployment plan records dated evidence and the remaining Store release gates.</w:t>
+        <w:t xml:space="preserve">Mail-Filter is a native macOS settings app and MailKit extension that analyzes incoming Apple Mail messages on-device and requests Junk actions for political solicitations. This guide explains how the code fits together, why the boundaries exist, and the invariants to preserve when changing it. It covers build 25, including the unified Xcode build, separate Dev installation and Store distribution. Version 2.1.0 passed App Review; later changes require their own qualification and review.</w:t>
       </w:r>
     </w:p>
     <w:p>
@@ -1809,7 +1809,7 @@
         <w:t xml:space="preserve">5.  </w:t>
       </w:r>
       <w:r>
-        <w:t xml:space="preserve">Generate a label within the retry/deadline budget and verify any positive against source evidence.</w:t>
+        <w:t xml:space="preserve">Generate a label within the retry/deadline budget and verify any positive against source evidence when keywords are configured.</w:t>
       </w:r>
     </w:p>
     <w:p>
@@ -1836,6 +1836,36 @@
       </w:r>
       <w:r>
         <w:t xml:space="preserve"> The handler does not receive the CLI's exact Mail account ID. It routes by delivered-to/original-to headers or visible recipients, so aliases, forwarding, Bcc, shared addresses and delivery into several accounts can be ambiguous. The UI selects stable account IDs, then saves their recipient addresses. All addresses from the collected inventory protect own-sender mail, including accounts not selected for filtering. Refresh the inventory when accounts or aliases change.</w:t>
+      </w:r>
+    </w:p>
+    <w:p>
+      <w:pPr>
+        <w:spacing w:after="120"/>
+      </w:pPr>
+      <w:r>
+        <w:t xml:space="preserve">Only the signed Development configuration defines </w:t>
+      </w:r>
+      <w:r>
+        <w:rPr>
+          <w:rFonts w:ascii="Courier New" w:hAnsi="Courier New" w:cs="Courier New"/>
+          <w:sz w:val="19"/>
+          <w:shd w:val="clear" w:color="auto" w:fill="F2F2F2"/>
+        </w:rPr>
+        <w:t xml:space="preserve">MAIL_FILTER_DEV</w:t>
+      </w:r>
+      <w:r>
+        <w:t xml:space="preserve">. It adds the opt-in </w:t>
+      </w:r>
+      <w:r>
+        <w:rPr>
+          <w:rFonts w:ascii="Courier New" w:hAnsi="Courier New" w:cs="Courier New"/>
+          <w:sz w:val="19"/>
+          <w:shd w:val="clear" w:color="auto" w:fill="F2F2F2"/>
+        </w:rPr>
+        <w:t xml:space="preserve">filterOwnMailForTesting</w:t>
+      </w:r>
+      <w:r>
+        <w:t xml:space="preserve"> field to NativeSettings, a self-mail switch in the Filtering page and a dedicated development routing entry point. The default is off, including when older settings lack the optional field. When on, incoming and read-only analysis omit only the own-sender exclusion. Selected recipients, meaningful body, identity/header limits, Preview, evidence and recovery still apply. Saving the switch creates a new revision, invalidating an in-flight result. Store and Local compile neither the field nor the bypass entry point; importing a Dev archive into production ignores that key. The CLI retains its existing own-sender guard.</w:t>
       </w:r>
     </w:p>
     <w:p>
@@ -2437,15 +2467,31 @@
         <w:spacing w:after="120"/>
       </w:pPr>
       <w:r>
-        <w:t xml:space="preserve">Model context is budgeted separately from character limits. On macOS 26.4 or later, actual token counts include instructions and the complete prompt. The planner reserves 64 output tokens and 512 framing tokens. Earlier systems estimate from UTF-8 length and start with smaller sections. Oversized requests are split with 128-character overlap; each split prompt carries opening and closing context from the same excerpt. There are at most 12 sections. Each section gets a fresh session. A positive may finish early; a negative requires every section to complete successfully.</w:t>
-      </w:r>
-    </w:p>
-    <w:p>
-      <w:pPr>
-        <w:spacing w:after="120"/>
-      </w:pPr>
-      <w:r>
-        <w:t xml:space="preserve">The model label does not authorize a move by itself. </w:t>
+        <w:t xml:space="preserve">Model context is budgeted separately from character limits. On macOS 26.4 or later, actual token counts include instructions and the complete prompt. The planner reserves 256 output tokens and 512 framing tokens. Build 24 starts with at most 3,000 characters per section; retries cap sections at 1,500 characters. Earlier systems estimate from UTF-8 length and start at 1,500. The first 6,000 body characters remain eligible. Oversized requests are split with 128-character overlap; each split prompt carries opening and closing context from the same excerpt. There are at most 12 sections. Each section gets a fresh session. A positive may finish early; a negative requires every section to complete successfully.</w:t>
+      </w:r>
+    </w:p>
+    <w:p>
+      <w:pPr>
+        <w:spacing w:after="120"/>
+      </w:pPr>
+      <w:r>
+        <w:t xml:space="preserve">Whole-label parsing tolerates boundary whitespace, byte-order/directional marks, whitespace inside paired double quotes and CRLF text fences. It does not strip characters from inside words or accept labels embedded in explanations, JSON or conflicting answers. These are formatting corrections; configured political evidence verification and restored-message protection still apply.</w:t>
+      </w:r>
+    </w:p>
+    <w:p>
+      <w:pPr>
+        <w:spacing w:after="120"/>
+      </w:pPr>
+      <w:r>
+        <w:t xml:space="preserve">The bundled policy no longer asks for a short explanation that conflicts with the label contract. Host startup recognizes the two prior standard-policy digests and upgrades only untouched policies; custom prompts and empty keyword lists are preserved.</w:t>
+      </w:r>
+    </w:p>
+    <w:p>
+      <w:pPr>
+        <w:spacing w:after="120"/>
+      </w:pPr>
+      <w:r>
+        <w:t xml:space="preserve">With a populated keyword list, the model label does not authorize a move by itself. </w:t>
       </w:r>
       <w:r>
         <w:rPr>
@@ -2457,6 +2503,14 @@
       </w:r>
       <w:r>
         <w:t xml:space="preserve"> requires a positive and a configured verification term in the subject or classified body. It recovers an actual subject, sentence or bounded source window; it does not use the sender or unseen remainder as evidence. A term match never promotes a negative result. Broad terms such as donation, candidate and campaign support verification only after the model identifies political purpose; the saved policy distinguishes political appeals from ordinary marketing, charity, medical information and personal correspondence.</w:t>
+      </w:r>
+    </w:p>
+    <w:p>
+      <w:pPr>
+        <w:spacing w:after="120"/>
+      </w:pPr>
+      <w:r>
+        <w:t xml:space="preserve">An explicitly empty keyword list disables this secondary verification in both native filtering and the CLI. It does not turn a negative or invalid response into a positive. Empty lists remain valid through save/load, setup migration and standard-list upgrades. Restore defaults loads the bundled prompt and keyword text into the two editors; Save Settings applies them with a new revision, preserving accounts, mode, pause and recovery data.</w:t>
       </w:r>
     </w:p>
     <w:p>
@@ -3163,7 +3217,7 @@
         <w:spacing w:after="120"/>
       </w:pPr>
       <w:r>
-        <w:t xml:space="preserve">Settings and activity use schema version 1; the embedded filtering configuration uses schema version 2. Writes are atomic and owner-readable/writable; newly created private directories use mode 0700. Activity is bounded to 1 MiB; settings allow 16 MiB for imported recovery digests. Protection accepts at most 100,000 digests within a 16 MiB input bound. Settings and protection have distinct locks; preserve their lock order and do not hold a lock across model generation.</w:t>
+        <w:t xml:space="preserve">Settings and activity use schema version 1; the embedded filtering configuration uses schema version 2. Writes are atomic and owner-readable/writable; newly created private directories use mode 0700. Activity is bounded to 1 MiB on both write and read; when rich metrics exceed that byte budget, oldest events are evicted before saving without changing aggregate counters or the retained extension-start identity; settings allow 16 MiB for imported recovery digests. Protection accepts at most 100,000 digests within a 16 MiB input bound. Settings and protection have distinct locks; preserve their lock order and do not hold a lock across model generation.</w:t>
       </w:r>
     </w:p>
     <w:p>
@@ -3228,7 +3282,7 @@
         <w:t xml:space="preserve">SharedStore.finish</w:t>
       </w:r>
       <w:r>
-        <w:t xml:space="preserve"> reloads settings under lock and requires the original revision, filtering still enabled, a positive with evidence, and no previous protection. Preview returns </w:t>
+        <w:t xml:space="preserve"> reloads settings under lock and requires the original revision, filtering still enabled, a positive with evidence when keywords are configured, and no previous protection. Preview returns </w:t>
       </w:r>
       <w:r>
         <w:rPr>
@@ -3297,6 +3351,63 @@
         <w:spacing w:after="120"/>
       </w:pPr>
       <w:r>
+        <w:t xml:space="preserve">Build 24 adds optional, validated numeric request measurements to the same activity schema: section and excerpt lengths, section limits, instruction/prompt token counts, model context size, output limit, response characters/UTF-8 bytes and elapsed milliseconds. macOS 27 also supplies actual input, output and reasoning token usage. Earlier systems leave usage unavailable and label estimated input counts explicitly. A measured output count reaching the configured limit is evidence to investigate truncation, not proof of its cause. Smaller starting sections and increased output headroom are intended to mitigate first-attempt failures; synthetic success does not establish that the affected Mac's original failure is fixed.</w:t>
+      </w:r>
+    </w:p>
+    <w:p>
+      <w:pPr>
+        <w:spacing w:after="120"/>
+      </w:pPr>
+      <w:r>
+        <w:t xml:space="preserve">Empty or whitespace-only output is </w:t>
+      </w:r>
+      <w:r>
+        <w:rPr>
+          <w:rFonts w:ascii="Courier New" w:hAnsi="Courier New" w:cs="Courier New"/>
+          <w:sz w:val="19"/>
+          <w:shd w:val="clear" w:color="auto" w:fill="F2F2F2"/>
+        </w:rPr>
+        <w:t xml:space="preserve">modelEmptyResponse</w:t>
+      </w:r>
+      <w:r>
+        <w:t xml:space="preserve">; nonempty text outside the two-label contract remains </w:t>
+      </w:r>
+      <w:r>
+        <w:rPr>
+          <w:rFonts w:ascii="Courier New" w:hAnsi="Courier New" w:cs="Courier New"/>
+          <w:sz w:val="19"/>
+          <w:shd w:val="clear" w:color="auto" w:fill="F2F2F2"/>
+        </w:rPr>
+        <w:t xml:space="preserve">invalidModelResponse</w:t>
+      </w:r>
+      <w:r>
+        <w:t xml:space="preserve">; refusals remain distinct. Request-start and request-finish events make unfinished generations visible without saving their text. Physical memory, observed Dispatch memory-pressure notifications and thermal state supply system context. Pressure is </w:t>
+      </w:r>
+      <w:r>
+        <w:rPr>
+          <w:rFonts w:ascii="Courier New" w:hAnsi="Courier New" w:cs="Courier New"/>
+          <w:sz w:val="19"/>
+          <w:shd w:val="clear" w:color="auto" w:fill="F2F2F2"/>
+        </w:rPr>
+        <w:t xml:space="preserve">unknown</w:t>
+      </w:r>
+      <w:r>
+        <w:t xml:space="preserve"> until a notification arrives; it is not inferred from installed RAM. Shared activity stores only whitelisted categories and bounded numeric measurements. These fields are additive; existing settings and recovery records are unchanged.</w:t>
+      </w:r>
+    </w:p>
+    <w:p>
+      <w:pPr>
+        <w:spacing w:after="120"/>
+      </w:pPr>
+      <w:r>
+        <w:t xml:space="preserve">Body-ready callbacks include their monotonic wait time when the same handler recorded the request. Support reports list requests older than 30 seconds that lack a newer matching body-ready event in retained history. That is an observation about bounded history, not a declaration of a Mail failure. It adds no timer, mailbox polling or automatic reprocessing. Explicit selected-email analysis includes per-attempt measurements and a bounded Unicode-scalar rendering of a rejected reply, so invisible characters can be inspected privately. Ordinary reports never contain that rendering or the reply itself.</w:t>
+      </w:r>
+    </w:p>
+    <w:p>
+      <w:pPr>
+        <w:spacing w:after="120"/>
+      </w:pPr>
+      <w:r>
         <w:t xml:space="preserve">The Store build reads this private history and exports reports through a Save panel; it compiles out the system-log collector with </w:t>
       </w:r>
       <w:r>
@@ -3352,6 +3463,22 @@
       </w:r>
       <w:r>
         <w:t xml:space="preserve"> is an engineering experiment, not another GUI or extension. The supported-path comparison reads exports and synthetic controls without accessing Mail, moving messages or changing settings. Historical guided/tagging trials remain comparisons and must not replace the production contract without actual model validation.</w:t>
+      </w:r>
+    </w:p>
+    <w:p>
+      <w:pPr>
+        <w:spacing w:after="120"/>
+      </w:pPr>
+      <w:r>
+        <w:t xml:space="preserve">The request-budget comparison independently varies maximum section size (6,000 or 3,000 characters) and output budget (64 or 256 tokens), retaining request measurements for successes and failures. It includes short and long synthetic receipt/campaign controls. This is an experiment; it neither changes production settings nor establishes that a particular hardware memory size caused a failure.</w:t>
+      </w:r>
+    </w:p>
+    <w:p>
+      <w:pPr>
+        <w:spacing w:after="120"/>
+      </w:pPr>
+      <w:r>
+        <w:t xml:space="preserve">The injected test transport implements the same PoliticalModel.Engine contract as the system adapter. Production selects fresh Apple string sessions; developer tests select scripted replies and errors. Both paths use identical token planning, section coverage, parser, numeric metrics and cancellation checks. NativeClassifier tests additionally inject a temporary store and short deadlines while retaining the real retry, scheduler and final protection gate. Fault scripts are test sources, excluded from shipped targets; there is no runtime fault setting in the Store app.</w:t>
       </w:r>
     </w:p>
     <w:p>
@@ -3374,7 +3501,7 @@
         <w:spacing w:after="120"/>
       </w:pPr>
       <w:r>
-        <w:t xml:space="preserve">The root Xcode project compiles the host, extension and uninstaller in Swift 5 language mode for arm64 macOS 26 and the CLI in Swift 6 mode. It processes the channel-specific metadata and entitlements, embeds the extension and default resources, and signs native products. Direct packaging adds engineering resources only to staged copies and reseals the host. The Swift package requires tools version 6.2. Store configurations select sandboxed host/extension entitlements, user-selected file access and a Mail-targeted host automation exception. Development and production identities/groups differ. Full Xcode supplies the SDK; no external library dependency is introduced.</w:t>
+        <w:t xml:space="preserve">The root Xcode project compiles the host, extension and uninstaller in Swift 5 language mode for arm64 macOS 26 and the CLI in Swift 6 mode. It processes the channel-specific metadata and entitlements, embeds the extension and default resources, and signs native products. Direct packaging adds engineering resources only to staged copies and reseals the host. The Swift package requires tools version 6.2. Store configurations select sandboxed host/extension entitlements, user-selected file access and a Mail-targeted host automation exception. Development displays Mail-Filter Dev and uses org.mail-filter.development with group.org.mail-filter.development.shared; Store uses org.mail-filter.app with group.org.mail-filter.shared. The explicit Mail-Filter Dev scheme and install-dev.sh stage the signed Dev app alongside Store without importing or sharing settings. Legacy Local packages still use the production bundle identity and must not replace a working Store app for routine testing. Full Xcode supplies the SDK; no external library dependency is introduced.</w:t>
       </w:r>
     </w:p>
     <w:p>
@@ -3426,7 +3553,7 @@
         <w:t xml:space="preserve">•  </w:t>
       </w:r>
       <w:r>
-        <w:t xml:space="preserve">A model positive, source evidence, unchanged settings and persistent reservation are all required before requesting Junk.</w:t>
+        <w:t xml:space="preserve">A model positive, source evidence when keywords are configured, unchanged settings and persistent reservation are required before requesting Junk.</w:t>
       </w:r>
     </w:p>
     <w:p>
@@ -3438,7 +3565,7 @@
         <w:t xml:space="preserve">•  </w:t>
       </w:r>
       <w:r>
-        <w:t xml:space="preserve">Own-sender, empty-body and restored-message protection run before model work. Never use verification words as an independent classifier.</w:t>
+        <w:t xml:space="preserve">Production own-sender, empty-body and restored-message protection run before model work. Only the opt-in Dev switch bypasses own-sender exclusion; its compile flag must never reach Store. Never use verification words as an independent classifier.</w:t>
       </w:r>
     </w:p>
     <w:p>
@@ -3510,26 +3637,6 @@
       </w:r>
       <w:r>
         <w:t xml:space="preserve">Update the project generator when adding shared files, verify channel build graphs, and keep native and CLI default resources aligned.</w:t>
-      </w:r>
-    </w:p>
-    <w:p>
-      <w:pPr>
-        <w:spacing w:after="40"/>
-        <w:ind w:left="360" w:hanging="360"/>
-      </w:pPr>
-      <w:r>
-        <w:t xml:space="preserve">•  </w:t>
-      </w:r>
-      <w:r>
-        <w:t xml:space="preserve">Build, sign and package through maintained scripts. Builds do not install, enable filtering or move mail.</w:t>
-      </w:r>
-    </w:p>
-    <w:p>
-      <w:pPr>
-        <w:spacing w:after="120"/>
-      </w:pPr>
-      <w:r>
-        <w:t xml:space="preserve">The getting-started guide maps these rules to checks and a review workflow. Synthetic tests establish contracts and failure handling; actual classifier accuracy, extension activation and mailbox delivery require controlled testing in a normal macOS session.</w:t>
       </w:r>
     </w:p>
     <w:sectPr>

</xml_diff>

<commit_message>
Serialize outstanding model calls and qualify queue timing
Keep SDK ownership until an await returns, cancel queued waiters promptly, and replace coalesced deadline delays with a strict one-shot timer. Add production-duration timing checks, cancellation races and historical-context/queued-model probes. Preserve the unresolved invalid-label investigation and Store review hold.
</commit_message>
<xml_diff>
--- a/docs/dev/architecture.docx
+++ b/docs/dev/architecture.docx
@@ -22,7 +22,7 @@
         <w:spacing w:after="120"/>
       </w:pPr>
       <w:r>
-        <w:t xml:space="preserve">Mail-Filter is a native macOS settings app and MailKit extension that analyzes incoming Apple Mail messages on-device and requests Junk actions for political solicitations. This guide explains how the code fits together, why the boundaries exist, and the invariants to preserve when changing it. It covers build 25, including the unified Xcode build, separate Dev installation and Store distribution. Version 2.1.0 passed App Review; later changes require their own qualification and review.</w:t>
+        <w:t xml:space="preserve">Mail-Filter is a native macOS settings app and MailKit extension that analyzes incoming Apple Mail messages on-device and requests Junk actions for political solicitations. This guide explains how the code fits together, why the boundaries exist, and the invariants to preserve when changing it. It covers candidate build 26, including the unified Xcode build, separate Dev installation and Store distribution. Version 2.1.0 passed App Review; later changes require their own qualification and review.</w:t>
       </w:r>
     </w:p>
     <w:p>
@@ -2871,7 +2871,94 @@
         <w:t xml:space="preserve">AnalysisDeadline</w:t>
       </w:r>
       <w:r>
-        <w:t xml:space="preserve"> returns even if an underlying operation ignores cancellation. Late results cannot reach the action gate. The caller checks cancellation before recording a usable model result or requesting an action. This does not guarantee the framework immediately stops physical inference. Queue overflow, unavailable bodies and terminal failures leave mail in place; there is no durable retry queue or guaranteed later MailKit callback.</w:t>
+        <w:t xml:space="preserve"> returns even if an underlying operation ignores cancellation. Late results cannot reach the action gate. Build 26 uses a strict one-shot Dispatch timer with 10 ms requested leeway; the earlier background </w:t>
+      </w:r>
+      <w:r>
+        <w:rPr>
+          <w:rFonts w:ascii="Courier New" w:hAnsi="Courier New" w:cs="Courier New"/>
+          <w:sz w:val="19"/>
+          <w:shd w:val="clear" w:color="auto" w:fill="F2F2F2"/>
+        </w:rPr>
+        <w:t xml:space="preserve">asyncAfter</w:t>
+      </w:r>
+      <w:r>
+        <w:t xml:space="preserve"> timer returned at about 63 seconds in a 60-second qualification. This tightens timer scheduling without increasing the configured limits. Scheduling remains best effort, not a hard real-time guarantee.</w:t>
+      </w:r>
+    </w:p>
+    <w:p>
+      <w:pPr>
+        <w:spacing w:after="120"/>
+      </w:pPr>
+      <w:r>
+        <w:rPr>
+          <w:rFonts w:ascii="Courier New" w:hAnsi="Courier New" w:cs="Courier New"/>
+          <w:sz w:val="19"/>
+          <w:shd w:val="clear" w:color="auto" w:fill="F2F2F2"/>
+        </w:rPr>
+        <w:t xml:space="preserve">ModelExecutionGate</w:t>
+      </w:r>
+      <w:r>
+        <w:t xml:space="preserve"> in </w:t>
+      </w:r>
+      <w:r>
+        <w:rPr>
+          <w:rFonts w:ascii="Courier New" w:hAnsi="Courier New" w:cs="Courier New"/>
+          <w:sz w:val="19"/>
+          <w:shd w:val="clear" w:color="auto" w:fill="F2F2F2"/>
+        </w:rPr>
+        <w:t xml:space="preserve">PoliticalModel.swift</w:t>
+      </w:r>
+      <w:r>
+        <w:t xml:space="preserve"> serializes actual SDK awaits within a process, including token counting. A canceled or timed-out caller cannot release an active SDK slot until the call returns. Canceled waiters leave promptly, and remaining waiters resume in order. Production </w:t>
+      </w:r>
+      <w:r>
+        <w:rPr>
+          <w:rFonts w:ascii="Courier New" w:hAnsi="Courier New" w:cs="Courier New"/>
+          <w:sz w:val="19"/>
+          <w:shd w:val="clear" w:color="auto" w:fill="F2F2F2"/>
+        </w:rPr>
+        <w:t xml:space="preserve">Engine.system</w:t>
+      </w:r>
+      <w:r>
+        <w:t xml:space="preserve"> always uses the shared gate. Some fault tests deliberately inject an ungated engine to reproduce the former overlap. The final action gate still discards every late result.</w:t>
+      </w:r>
+    </w:p>
+    <w:p>
+      <w:pPr>
+        <w:spacing w:after="120"/>
+      </w:pPr>
+      <w:r>
+        <w:t xml:space="preserve">This distinction matters: </w:t>
+      </w:r>
+      <w:r>
+        <w:rPr>
+          <w:rFonts w:ascii="Courier New" w:hAnsi="Courier New" w:cs="Courier New"/>
+          <w:sz w:val="19"/>
+          <w:shd w:val="clear" w:color="auto" w:fill="F2F2F2"/>
+        </w:rPr>
+        <w:t xml:space="preserve">InspectionScheduler</w:t>
+      </w:r>
+      <w:r>
+        <w:t xml:space="preserve"> serializes logical message jobs, while </w:t>
+      </w:r>
+      <w:r>
+        <w:rPr>
+          <w:rFonts w:ascii="Courier New" w:hAnsi="Courier New" w:cs="Courier New"/>
+          <w:sz w:val="19"/>
+          <w:shd w:val="clear" w:color="auto" w:fill="F2F2F2"/>
+        </w:rPr>
+        <w:t xml:space="preserve">ModelExecutionGate</w:t>
+      </w:r>
+      <w:r>
+        <w:t xml:space="preserve"> owns the longer-lived SDK call. The full-duration qualification reproduced two concurrent unreturned calls under the former transport and one with the corrected adapter. Separate processes still have separate gates, and an SDK return cannot establish that Apple’s underlying service has stopped physical inference. No test claims machine-wide model exclusivity or automatic recovery from an SDK call that never returns.</w:t>
+      </w:r>
+    </w:p>
+    <w:p>
+      <w:pPr>
+        <w:spacing w:after="120"/>
+      </w:pPr>
+      <w:r>
+        <w:t xml:space="preserve">Queued job cancellation now removes the waiter promptly without running its operation. MailKit action completions remain pending through queueing and analysis; the callback thread itself returns promptly. This is not a guarantee that Mail’s download pipeline is unaffected. Queue residence has no separate deadline, and there is no durable retry queue or guaranteed later MailKit callback. These delivery and backlog limits require explicit qualification before proposing a broader queue redesign.</w:t>
       </w:r>
     </w:p>
     <w:p>
@@ -3478,7 +3565,48 @@
         <w:spacing w:after="120"/>
       </w:pPr>
       <w:r>
-        <w:t xml:space="preserve">The injected test transport implements the same PoliticalModel.Engine contract as the system adapter. Production selects fresh Apple string sessions; developer tests select scripted replies and errors. Both paths use identical token planning, section coverage, parser, numeric metrics and cancellation checks. NativeClassifier tests additionally inject a temporary store and short deadlines while retaining the real retry, scheduler and final protection gate. Fault scripts are test sources, excluded from shipped targets; there is no runtime fault setting in the Store app.</w:t>
+        <w:t xml:space="preserve">The injected test transport implements the same PoliticalModel.Engine contract as the system adapter. </w:t>
+      </w:r>
+      <w:r>
+        <w:rPr>
+          <w:rFonts w:ascii="Courier New" w:hAnsi="Courier New" w:cs="Courier New"/>
+          <w:sz w:val="19"/>
+          <w:shd w:val="clear" w:color="auto" w:fill="F2F2F2"/>
+        </w:rPr>
+        <w:t xml:space="preserve">ModelGateChecks.swift</w:t>
+      </w:r>
+      <w:r>
+        <w:t xml:space="preserve"> adds 200 cancellation/handoff races and FIFO/error/tokenization checks; the accelerated timing suite is part of the normal native tests. </w:t>
+      </w:r>
+      <w:r>
+        <w:rPr>
+          <w:rFonts w:ascii="Courier New" w:hAnsi="Courier New" w:cs="Courier New"/>
+          <w:sz w:val="19"/>
+          <w:shd w:val="clear" w:color="auto" w:fill="F2F2F2"/>
+        </w:rPr>
+        <w:t xml:space="preserve">qualify-timing.sh --full</w:t>
+      </w:r>
+      <w:r>
+        <w:t xml:space="preserve"> separately uses actual 20-/60-second budgets and 1-/2-second retry delays, with real timers and scripted SDK stalls. </w:t>
+      </w:r>
+      <w:r>
+        <w:rPr>
+          <w:rFonts w:ascii="Courier New" w:hAnsi="Courier New" w:cs="Courier New"/>
+          <w:sz w:val="19"/>
+          <w:shd w:val="clear" w:color="auto" w:fill="F2F2F2"/>
+        </w:rPr>
+        <w:t xml:space="preserve">probe-model-queue.sh</w:t>
+      </w:r>
+      <w:r>
+        <w:t xml:space="preserve"> uses the actual model, fictional dense-link messages and temporary NativeClassifier state to compare queued and paced blocks and recreate the historical unbudgeted context error. See the timing and queue investigation for results and limits.</w:t>
+      </w:r>
+    </w:p>
+    <w:p>
+      <w:pPr>
+        <w:spacing w:after="120"/>
+      </w:pPr>
+      <w:r>
+        <w:t xml:space="preserve">Production selects fresh Apple string sessions; developer tests select scripted replies and errors. Both paths use identical token planning, section coverage, parser, numeric metrics and cancellation checks. NativeClassifier tests additionally inject a temporary store and short deadlines while retaining the real retry, scheduler and final protection gate. Fault scripts are test sources, excluded from shipped targets; there is no runtime fault setting in the Store app.</w:t>
       </w:r>
     </w:p>
     <w:p>

</xml_diff>

<commit_message>
Retain rejected model replies and qualify clean build 27
</commit_message>
<xml_diff>
--- a/docs/dev/architecture.docx
+++ b/docs/dev/architecture.docx
@@ -22,7 +22,7 @@
         <w:spacing w:after="120"/>
       </w:pPr>
       <w:r>
-        <w:t xml:space="preserve">Mail-Filter is a native macOS settings app and MailKit extension that analyzes incoming Apple Mail messages on-device and requests Junk actions for political solicitations. This guide explains how the code fits together, why the boundaries exist, and the invariants to preserve when changing it. It covers candidate build 26, including the unified Xcode build, separate Dev installation and Store distribution. Version 2.1.0 passed App Review; later changes require their own qualification and review.</w:t>
+        <w:t xml:space="preserve">Mail-Filter is a native macOS settings app and MailKit extension that analyzes incoming Apple Mail messages on-device and requests Junk actions for political solicitations. This guide explains how the code fits together, why the boundaries exist, and the invariants to preserve when changing it. It covers candidate build 27, including the unified Xcode build, separate Dev installation and Store distribution. Version 2.1.0 passed App Review; later changes require their own qualification and review.</w:t>
       </w:r>
     </w:p>
     <w:p>
@@ -3534,6 +3534,33 @@
       </w:pPr>
       <w:r>
         <w:t xml:space="preserve">An explicit selected-email export includes full RFC source as base64, extracted excerpt or decoding error, current policy, opaque key, retained history and a matching cached analysis. Cached analysis must match message identity and policy revision. The export can contain private content and is written with mode 0600. It excludes the account inventory but is not a sanitized public artifact. Keep reports and extracted emails outside this public repository; ignore patterns are only a secondary defense.</w:t>
+      </w:r>
+    </w:p>
+    <w:p>
+      <w:pPr>
+        <w:spacing w:after="120"/>
+      </w:pPr>
+      <w:r>
+        <w:t xml:space="preserve">Build 27 keeps an owner-only </w:t>
+      </w:r>
+      <w:r>
+        <w:rPr>
+          <w:rFonts w:ascii="Courier New" w:hAnsi="Courier New" w:cs="Courier New"/>
+          <w:sz w:val="19"/>
+          <w:shd w:val="clear" w:color="auto" w:fill="F2F2F2"/>
+        </w:rPr>
+        <w:t xml:space="preserve">model-failures.json</w:t>
+      </w:r>
+      <w:r>
+        <w:t xml:space="preserve"> cache of automatic rejected replies, including failures followed by successful retries. It stores exact UTF-8 bytes (up to 8 KiB), full-reply SHA-256, truncation, policy revision, request ID, instruction/prompt fingerprints and metrics. Limits are 32 records and 512 KiB. Exports exclude records older than seven days; subsequent writes prune them. Corruption can be recovered without changing settings or protection. Capture failure cannot block classification. Application-data removal deletes the cache.</w:t>
+      </w:r>
+    </w:p>
+    <w:p>
+      <w:pPr>
+        <w:spacing w:after="120"/>
+      </w:pPr>
+      <w:r>
+        <w:t xml:space="preserve">These replies may contain private email text and appear only in explicit matching-email exports, which indicate cache availability. Ordinary activity, Console and application reports exclude them. Current environment metadata is labeled as current; per-request variant and reasoning capability describe the automatic call. Fingerprints cannot reconstruct an earlier custom policy. Queue admission duration, completed model-slot wait and ownership at failures distinguish backlog from outstanding SDK awaits. They do not observe Apple's internal cleanup or coordinate processes.</w:t>
       </w:r>
     </w:p>
     <w:p>

</xml_diff>

<commit_message>
Isolate Dev installer from Store and display version and build
</commit_message>
<xml_diff>
--- a/docs/dev/architecture.docx
+++ b/docs/dev/architecture.docx
@@ -108,7 +108,7 @@
         <w:spacing w:after="120"/>
       </w:pPr>
       <w:r>
-        <w:t xml:space="preserve">The direct installer contains a settings app, an embedded MailKit extension, an engineering CLI, and a separate uninstaller. The Store payload contains only the settings app and extension. The settings window does not host the extension. Mail loads the extension in its own process and calls it as messages arrive. Closing Mail-Filter leaves that process independent; Mail must be running and the Mac awake for incoming processing.</w:t>
+        <w:t xml:space="preserve">The legacy direct installer contains a settings app, an embedded MailKit extension, an engineering CLI, and a separate uninstaller. The default Dev installer contains the isolated Dev app/extension plus an optional CLI outside the app bundle. The Store payload contains only the settings app and extension. The settings window does not host the extension. Mail loads the extension in its own process and calls it as messages arrive. Closing Mail-Filter leaves that process independent; Mail must be running and the Mac awake for incoming processing.</w:t>
       </w:r>
     </w:p>
     <w:tbl>
@@ -439,7 +439,7 @@
         <w:t xml:space="preserve">package.sh</w:t>
       </w:r>
       <w:r>
-        <w:t xml:space="preserve"> builds the installer from that verified staging area. Store schemes exclude the CLI, uninstaller and packaging helper from their target graph and payload.</w:t>
+        <w:t xml:space="preserve"> builds the installer from that verified staging area. The Dev installer aggregate instead depends on the Development host and CLI, preserves the app signature, and packages the CLI separately under Library/Application Support/Mail-Filter Dev/DeveloperTools. It installs only /Applications/Mail-Filter Dev.app with a distinct installer receipt. Store schemes exclude the CLI, uninstaller and packaging helpers from their target graph and payload.</w:t>
       </w:r>
     </w:p>
     <w:p>
@@ -3656,7 +3656,7 @@
         <w:spacing w:after="120"/>
       </w:pPr>
       <w:r>
-        <w:t xml:space="preserve">The root Xcode project compiles the host, extension and uninstaller in Swift 5 language mode for arm64 macOS 26 and the CLI in Swift 6 mode. It processes the channel-specific metadata and entitlements, embeds the extension and default resources, and signs native products. Direct packaging adds engineering resources only to staged copies and reseals the host. The Swift package requires tools version 6.2. Store configurations select sandboxed host/extension entitlements, user-selected file access and a Mail-targeted host automation exception. Development displays Mail-Filter Dev and uses org.mail-filter.development with group.org.mail-filter.development.shared; Store uses org.mail-filter.app with group.org.mail-filter.shared. The explicit Mail-Filter Dev scheme and install-dev.sh stage the signed Dev app alongside Store without importing or sharing settings. Legacy Local packages still use the production bundle identity and must not replace a working Store app for routine testing. Full Xcode supplies the SDK; no external library dependency is introduced.</w:t>
+        <w:t xml:space="preserve">The root Xcode project compiles the host, extension and uninstaller in Swift 5 language mode for arm64 macOS 26 and the CLI in Swift 6 mode. It processes the channel-specific metadata and entitlements, embeds the extension and default resources, and signs native products. Direct packaging adds engineering resources only to staged copies and reseals the host. The Swift package requires tools version 6.2. Store configurations select sandboxed host/extension entitlements, user-selected file access and a Mail-targeted host automation exception. Development displays Mail-Filter Dev and uses org.mail-filter.development with group.org.mail-filter.development.shared; Store uses org.mail-filter.app with group.org.mail-filter.shared. The explicit Mail-Filter Dev scheme and install-dev.sh stage the signed Dev app alongside Store without importing or sharing settings. The default package.sh and Dev Installer scheme package that same isolated app under /Applications/Mail-Filter Dev.app. The installer title, introduction and conclusion include marketing version and build. Legacy Local packages still use the production identity; their preinstall guard now rejects Store metadata, receipts and unexpected destinations. The obsolete generic installer shortcut is retired after successful Dev packaging. Mail owns independent extension checkboxes; no public MailKit API enforces exclusivity. Users must disable one before enabling the other. No new cross-group coordination or filtering behavior is introduced by packaging. Full Xcode supplies the SDK; no external library dependency is introduced.</w:t>
       </w:r>
     </w:p>
     <w:p>

</xml_diff>

<commit_message>
Clarify Dev self-mail filtering and enable it by default
</commit_message>
<xml_diff>
--- a/docs/dev/architecture.docx
+++ b/docs/dev/architecture.docx
@@ -1854,7 +1854,7 @@
         <w:t xml:space="preserve">MAIL_FILTER_DEV</w:t>
       </w:r>
       <w:r>
-        <w:t xml:space="preserve">. It adds the opt-in </w:t>
+        <w:t xml:space="preserve">. It adds the optional </w:t>
       </w:r>
       <w:r>
         <w:rPr>
@@ -1865,7 +1865,16 @@
         <w:t xml:space="preserve">filterOwnMailForTesting</w:t>
       </w:r>
       <w:r>
-        <w:t xml:space="preserve"> field to NativeSettings, a self-mail switch in the Filtering page and a dedicated development routing entry point. The default is off, including when older settings lack the optional field. When on, incoming and read-only analysis omit only the own-sender exclusion. Selected recipients, meaningful body, identity/header limits, Preview, evidence and recovery still apply. Saving the switch creates a new revision, invalidating an in-flight result. Store and Local compile neither the field nor the bypass entry point; importing a Dev archive into production ignores that key. The CLI retains its existing own-sender guard.</w:t>
+        <w:t xml:space="preserve"> field to NativeSettings, an </w:t>
+      </w:r>
+      <w:r>
+        <w:rPr>
+          <w:b/>
+        </w:rPr>
+        <w:t xml:space="preserve">Analyze and filter self-sent mail (Dev)</w:t>
+      </w:r>
+      <w:r>
+        <w:t xml:space="preserve"> switch and a dedicated development routing entry point. The Dev default is ON, including older settings without the field; an explicitly saved false remains OFF. ON omits only the own-sender exclusion for incoming and read-only analysis; OFF protects own senders without AI analysis. The UI explains each state and marks changes that still need Save Settings. Selected recipients, meaningful body, identity/header limits, Preview, evidence and recovery still apply. Saving the switch creates a new revision, invalidating an in-flight result. Store and Local compile neither the field nor the bypass entry point; importing a Dev archive into production ignores that key. The CLI retains its existing own-sender guard.</w:t>
       </w:r>
     </w:p>
     <w:p>
@@ -3720,7 +3729,7 @@
         <w:t xml:space="preserve">•  </w:t>
       </w:r>
       <w:r>
-        <w:t xml:space="preserve">Production own-sender, empty-body and restored-message protection run before model work. Only the opt-in Dev switch bypasses own-sender exclusion; its compile flag must never reach Store. Never use verification words as an independent classifier.</w:t>
+        <w:t xml:space="preserve">Production own-sender, empty-body and restored-message protection run before model work. Only the Dev switch bypasses own-sender exclusion; its compile flag must never reach Store. Never use verification words as an independent classifier.</w:t>
       </w:r>
     </w:p>
     <w:p>

</xml_diff>